<commit_message>
ADd Git repo too the report
</commit_message>
<xml_diff>
--- a/24064087 report.docx
+++ b/24064087 report.docx
@@ -143,6 +143,32 @@
       <w:pPr>
         <w:jc w:val="center"/>
       </w:pPr>
+    </w:p>
+    <w:p>
+      <w:pPr>
+        <w:jc w:val="center"/>
+        <w:rPr>
+          <w:b/>
+          <w:bCs/>
+        </w:rPr>
+      </w:pPr>
+      <w:r>
+        <w:rPr>
+          <w:b/>
+          <w:bCs/>
+        </w:rPr>
+        <w:t xml:space="preserve">GitHub Repository: </w:t>
+      </w:r>
+      <w:hyperlink r:id="rId6" w:history="1">
+        <w:r>
+          <w:rPr>
+            <w:rStyle w:val="Hyperlink"/>
+            <w:b/>
+            <w:bCs/>
+          </w:rPr>
+          <w:t>https://github.com/ianforbes42/DeclinePredictionPricingTool</w:t>
+        </w:r>
+      </w:hyperlink>
     </w:p>
     <w:p>
       <w:pPr>
@@ -3906,7 +3932,19 @@
     </w:p>
     <w:p>
       <w:r>
-        <w:t>This literature therefore supports the project in five ways: reframing decline as gradual rather than binary, which shapes the target definition, locating an affiliate network's semi-contractual position between the typology's opposites, which shapes who the model should and should not score, justifying gross-profit weighting throughout evaluation, providing an insurance-sector precedent for turning a risk score directly into a price, and showing that sharp discontinuities carry fairness and operational risk even where the underlying score is accurate, which is why the final curve is constrained rather than left to optimise unchecked.</w:t>
+        <w:t>This literature therefore supports the project in five ways: reframing decline as gradual rather than binary</w:t>
+      </w:r>
+      <w:r>
+        <w:t xml:space="preserve"> </w:t>
+      </w:r>
+      <w:r>
+        <w:t>which shapes the target definition, locating an affiliate network's semi-contractual position between the typology's opposites which shapes who the model should and should not score, justifying gross-profit weighting throughout evaluation</w:t>
+      </w:r>
+      <w:r>
+        <w:t xml:space="preserve"> </w:t>
+      </w:r>
+      <w:r>
+        <w:t>providing an insurance-sector precedent for turning a risk score directly into a price, and showing that sharp discontinuities carry fairness and operational risk even where the underlying score is accurate which is why the final curve is constrained rather than left to optimise unchecked.</w:t>
       </w:r>
     </w:p>
     <w:p>
@@ -3995,7 +4033,7 @@
                     <pic:cNvPicPr/>
                   </pic:nvPicPr>
                   <pic:blipFill>
-                    <a:blip r:embed="rId6"/>
+                    <a:blip r:embed="rId7"/>
                     <a:stretch>
                       <a:fillRect/>
                     </a:stretch>
@@ -4150,6 +4188,7 @@
     </w:p>
     <w:p>
       <w:r>
+        <w:lastRenderedPageBreak/>
         <w:t>Two decisions were made on the data - momentum comparisons are made year-on-year, not against the immediately preceding period, to avoid flagging every advertiser as declining each January; and the nested year-on-year windows, strongly correlated with the three-month window, were excluded from the feature set as carrying no independent information. Missing values use explicit missingness flags alongside neutral imputation, so absence remains visible as information.</w:t>
       </w:r>
     </w:p>
@@ -4460,7 +4499,7 @@
                     <pic:cNvPicPr/>
                   </pic:nvPicPr>
                   <pic:blipFill>
-                    <a:blip r:embed="rId7"/>
+                    <a:blip r:embed="rId8"/>
                     <a:stretch>
                       <a:fillRect/>
                     </a:stretch>
@@ -4539,7 +4578,7 @@
                     <pic:cNvPicPr/>
                   </pic:nvPicPr>
                   <pic:blipFill>
-                    <a:blip r:embed="rId8"/>
+                    <a:blip r:embed="rId9"/>
                     <a:stretch>
                       <a:fillRect/>
                     </a:stretch>
@@ -4595,6 +4634,7 @@
     </w:p>
     <w:p>
       <w:r>
+        <w:lastRenderedPageBreak/>
         <w:t xml:space="preserve">The highest-risk advertisers also show strong concentration of actual decline. The top 5% by predicted risk have an 89.5% weighted decline rate and the top 10% have an 85.8% rate, compared with a 45.1% GP-weighted base rate. </w:t>
       </w:r>
     </w:p>
@@ -4622,7 +4662,7 @@
                     <pic:cNvPicPr/>
                   </pic:nvPicPr>
                   <pic:blipFill>
-                    <a:blip r:embed="rId9"/>
+                    <a:blip r:embed="rId10"/>
                     <a:stretch>
                       <a:fillRect/>
                     </a:stretch>
@@ -4716,7 +4756,7 @@
                     <pic:cNvPicPr/>
                   </pic:nvPicPr>
                   <pic:blipFill>
-                    <a:blip r:embed="rId10"/>
+                    <a:blip r:embed="rId11"/>
                     <a:stretch>
                       <a:fillRect/>
                     </a:stretch>
@@ -4811,7 +4851,7 @@
                     <pic:cNvPicPr/>
                   </pic:nvPicPr>
                   <pic:blipFill>
-                    <a:blip r:embed="rId11"/>
+                    <a:blip r:embed="rId12"/>
                     <a:stretch>
                       <a:fillRect/>
                     </a:stretch>
@@ -4880,7 +4920,7 @@
                     <pic:cNvPicPr/>
                   </pic:nvPicPr>
                   <pic:blipFill>
-                    <a:blip r:embed="rId12"/>
+                    <a:blip r:embed="rId13"/>
                     <a:stretch>
                       <a:fillRect/>
                     </a:stretch>
@@ -6899,6 +6939,18 @@
       <w:u w:val="single"/>
     </w:rPr>
   </w:style>
+  <w:style w:type="character" w:styleId="UnresolvedMention">
+    <w:name w:val="Unresolved Mention"/>
+    <w:basedOn w:val="DefaultParagraphFont"/>
+    <w:uiPriority w:val="99"/>
+    <w:semiHidden/>
+    <w:unhideWhenUsed/>
+    <w:rsid w:val="00D311C3"/>
+    <w:rPr>
+      <w:color w:val="605E5C"/>
+      <w:shd w:val="clear" w:color="auto" w:fill="E1DFDD"/>
+    </w:rPr>
+  </w:style>
 </w:styles>
 </file>
 

</xml_diff>